<commit_message>
Updating supervisor meeting templates
</commit_message>
<xml_diff>
--- a/assets/docs/FCAI_C4_supervisor_meeting_templates.docx
+++ b/assets/docs/FCAI_C4_supervisor_meeting_templates.docx
@@ -473,6 +473,73 @@
           <w:ilvl w:val="0"/>
           <w:numId w:val="2"/>
         </w:numPr>
+        <w:rPr>
+          <w:rFonts w:eastAsiaTheme="minorEastAsia" w:cstheme="minorHAnsi"/>
+          <w:lang w:val="en-US" w:eastAsia="en-GB"/>
+        </w:rPr>
+      </w:pPr>
+      <w:r>
+        <w:rPr>
+          <w:rFonts w:eastAsia="Times New Roman" w:cstheme="minorHAnsi"/>
+          <w:lang w:val="en-US" w:eastAsia="en-GB"/>
+        </w:rPr>
+        <w:t>Use this same document to record all 3 supervision meetings- it serves as a longitudinal record of progress at each stage. Do not split into 3 separate documents.</w:t>
+      </w:r>
+    </w:p>
+    <w:p>
+      <w:pPr>
+        <w:pStyle w:val="ListParagraph"/>
+        <w:numPr>
+          <w:ilvl w:val="0"/>
+          <w:numId w:val="2"/>
+        </w:numPr>
+        <w:rPr>
+          <w:rFonts w:eastAsiaTheme="minorEastAsia" w:cstheme="minorHAnsi"/>
+          <w:lang w:val="en-US" w:eastAsia="en-GB"/>
+        </w:rPr>
+      </w:pPr>
+      <w:r>
+        <w:rPr>
+          <w:rFonts w:eastAsia="Times New Roman" w:cstheme="minorHAnsi"/>
+          <w:lang w:val="en-US" w:eastAsia="en-GB"/>
+        </w:rPr>
+        <w:t xml:space="preserve">Rename this document: </w:t>
+      </w:r>
+      <w:r>
+        <w:rPr>
+          <w:rFonts w:eastAsia="Times New Roman" w:cstheme="minorHAnsi"/>
+          <w:i/>
+          <w:iCs/>
+          <w:lang w:val="en-US" w:eastAsia="en-GB"/>
+        </w:rPr>
+        <w:t>FCAI_C4_supervisor_meeting</w:t>
+      </w:r>
+      <w:r>
+        <w:rPr>
+          <w:rFonts w:eastAsia="Times New Roman" w:cstheme="minorHAnsi"/>
+          <w:i/>
+          <w:iCs/>
+          <w:lang w:val="en-US" w:eastAsia="en-GB"/>
+        </w:rPr>
+        <w:t>_</w:t>
+      </w:r>
+      <w:r>
+        <w:rPr>
+          <w:rFonts w:eastAsia="Times New Roman" w:cstheme="minorHAnsi"/>
+          <w:i/>
+          <w:iCs/>
+          <w:lang w:val="en-US" w:eastAsia="en-GB"/>
+        </w:rPr>
+        <w:t>1_fellowname</w:t>
+      </w:r>
+    </w:p>
+    <w:p>
+      <w:pPr>
+        <w:pStyle w:val="ListParagraph"/>
+        <w:numPr>
+          <w:ilvl w:val="0"/>
+          <w:numId w:val="2"/>
+        </w:numPr>
         <w:textAlignment w:val="baseline"/>
         <w:rPr>
           <w:rFonts w:eastAsiaTheme="minorEastAsia" w:cstheme="minorHAnsi"/>
@@ -566,14 +633,14 @@
           <w:rFonts w:eastAsia="Times New Roman" w:cstheme="minorHAnsi"/>
           <w:lang w:val="en" w:eastAsia="en-GB"/>
         </w:rPr>
-        <w:t>&amp; cc supervisor</w:t>
-      </w:r>
-      <w:r>
-        <w:rPr>
-          <w:rFonts w:eastAsia="Times New Roman" w:cstheme="minorHAnsi"/>
-          <w:lang w:eastAsia="en-GB"/>
-        </w:rPr>
-        <w:t> </w:t>
+        <w:t>&amp; cc superviso</w:t>
+      </w:r>
+      <w:r>
+        <w:rPr>
+          <w:rFonts w:eastAsia="Times New Roman" w:cstheme="minorHAnsi"/>
+          <w:lang w:val="en" w:eastAsia="en-GB"/>
+        </w:rPr>
+        <w:t>r</w:t>
       </w:r>
     </w:p>
     <w:p>
@@ -2442,6 +2509,80 @@
         </w:numPr>
         <w:rPr>
           <w:rFonts w:eastAsiaTheme="minorEastAsia" w:cstheme="minorHAnsi"/>
+          <w:lang w:val="en-US" w:eastAsia="en-GB"/>
+        </w:rPr>
+      </w:pPr>
+      <w:r>
+        <w:rPr>
+          <w:rFonts w:eastAsia="Times New Roman" w:cstheme="minorHAnsi"/>
+          <w:lang w:val="en-US" w:eastAsia="en-GB"/>
+        </w:rPr>
+        <w:t>Use this same document to record all 3 supervision meetings- it serves as a longitudinal record of progress at each stage. Do not split into 3 separate documents.</w:t>
+      </w:r>
+    </w:p>
+    <w:p>
+      <w:pPr>
+        <w:pStyle w:val="ListParagraph"/>
+        <w:numPr>
+          <w:ilvl w:val="0"/>
+          <w:numId w:val="2"/>
+        </w:numPr>
+        <w:rPr>
+          <w:rFonts w:eastAsiaTheme="minorEastAsia" w:cstheme="minorHAnsi"/>
+          <w:lang w:val="en-US" w:eastAsia="en-GB"/>
+        </w:rPr>
+      </w:pPr>
+      <w:r>
+        <w:rPr>
+          <w:rFonts w:eastAsia="Times New Roman" w:cstheme="minorHAnsi"/>
+          <w:lang w:val="en-US" w:eastAsia="en-GB"/>
+        </w:rPr>
+        <w:t>Rename this document</w:t>
+      </w:r>
+      <w:r>
+        <w:rPr>
+          <w:rFonts w:eastAsia="Times New Roman" w:cstheme="minorHAnsi"/>
+          <w:lang w:val="en-US" w:eastAsia="en-GB"/>
+        </w:rPr>
+        <w:t xml:space="preserve">: </w:t>
+      </w:r>
+      <w:r>
+        <w:rPr>
+          <w:rFonts w:eastAsia="Times New Roman" w:cstheme="minorHAnsi"/>
+          <w:i/>
+          <w:iCs/>
+          <w:lang w:val="en-US" w:eastAsia="en-GB"/>
+        </w:rPr>
+        <w:t>FCAI_C4_supervisor_meeting</w:t>
+      </w:r>
+      <w:r>
+        <w:rPr>
+          <w:rFonts w:eastAsia="Times New Roman" w:cstheme="minorHAnsi"/>
+          <w:i/>
+          <w:iCs/>
+          <w:lang w:val="en-US" w:eastAsia="en-GB"/>
+        </w:rPr>
+        <w:t>_2</w:t>
+      </w:r>
+      <w:r>
+        <w:rPr>
+          <w:rFonts w:eastAsia="Times New Roman" w:cstheme="minorHAnsi"/>
+          <w:i/>
+          <w:iCs/>
+          <w:lang w:val="en-US" w:eastAsia="en-GB"/>
+        </w:rPr>
+        <w:t>_fellowname</w:t>
+      </w:r>
+    </w:p>
+    <w:p>
+      <w:pPr>
+        <w:pStyle w:val="ListParagraph"/>
+        <w:numPr>
+          <w:ilvl w:val="0"/>
+          <w:numId w:val="2"/>
+        </w:numPr>
+        <w:rPr>
+          <w:rFonts w:eastAsiaTheme="minorEastAsia" w:cstheme="minorHAnsi"/>
         </w:rPr>
       </w:pPr>
       <w:r>
@@ -4246,6 +4387,96 @@
           <w:lang w:val="en-US" w:eastAsia="en-GB"/>
         </w:rPr>
         <w:t xml:space="preserve"> in discussion with the fellow.</w:t>
+      </w:r>
+    </w:p>
+    <w:p>
+      <w:pPr>
+        <w:pStyle w:val="ListParagraph"/>
+        <w:numPr>
+          <w:ilvl w:val="0"/>
+          <w:numId w:val="2"/>
+        </w:numPr>
+        <w:rPr>
+          <w:rFonts w:eastAsiaTheme="minorEastAsia" w:cstheme="minorHAnsi"/>
+          <w:lang w:val="en-US" w:eastAsia="en-GB"/>
+        </w:rPr>
+      </w:pPr>
+      <w:r>
+        <w:rPr>
+          <w:rFonts w:eastAsia="Times New Roman" w:cstheme="minorHAnsi"/>
+          <w:lang w:val="en-US" w:eastAsia="en-GB"/>
+        </w:rPr>
+        <w:t>Use this same document to record all 3 supervision meetings- it serves as a longitudinal record of progress</w:t>
+      </w:r>
+      <w:r>
+        <w:rPr>
+          <w:rFonts w:eastAsia="Times New Roman" w:cstheme="minorHAnsi"/>
+          <w:lang w:val="en-US" w:eastAsia="en-GB"/>
+        </w:rPr>
+        <w:t xml:space="preserve"> at each stage</w:t>
+      </w:r>
+      <w:r>
+        <w:rPr>
+          <w:rFonts w:eastAsia="Times New Roman" w:cstheme="minorHAnsi"/>
+          <w:lang w:val="en-US" w:eastAsia="en-GB"/>
+        </w:rPr>
+        <w:t>. Do not split into 3 separate documents.</w:t>
+      </w:r>
+    </w:p>
+    <w:p>
+      <w:pPr>
+        <w:pStyle w:val="ListParagraph"/>
+        <w:numPr>
+          <w:ilvl w:val="0"/>
+          <w:numId w:val="2"/>
+        </w:numPr>
+        <w:rPr>
+          <w:rFonts w:eastAsiaTheme="minorEastAsia" w:cstheme="minorHAnsi"/>
+          <w:lang w:val="en-US" w:eastAsia="en-GB"/>
+        </w:rPr>
+      </w:pPr>
+      <w:r>
+        <w:rPr>
+          <w:rFonts w:eastAsia="Times New Roman" w:cstheme="minorHAnsi"/>
+          <w:lang w:val="en-US" w:eastAsia="en-GB"/>
+        </w:rPr>
+        <w:t xml:space="preserve">Rename this document: </w:t>
+      </w:r>
+      <w:r>
+        <w:rPr>
+          <w:rFonts w:eastAsia="Times New Roman" w:cstheme="minorHAnsi"/>
+          <w:i/>
+          <w:iCs/>
+          <w:lang w:val="en-US" w:eastAsia="en-GB"/>
+        </w:rPr>
+        <w:t>FCAI_C4_supervisor_meeting</w:t>
+      </w:r>
+      <w:r>
+        <w:rPr>
+          <w:rFonts w:eastAsia="Times New Roman" w:cstheme="minorHAnsi"/>
+          <w:i/>
+          <w:iCs/>
+          <w:lang w:val="en-US" w:eastAsia="en-GB"/>
+        </w:rPr>
+        <w:t>_</w:t>
+      </w:r>
+      <w:r>
+        <w:rPr>
+          <w:rFonts w:eastAsia="Times New Roman" w:cstheme="minorHAnsi"/>
+          <w:i/>
+          <w:iCs/>
+          <w:lang w:val="en-US" w:eastAsia="en-GB"/>
+        </w:rPr>
+        <w:t>3</w:t>
+      </w:r>
+      <w:r>
+        <w:rPr>
+          <w:rFonts w:eastAsia="Times New Roman" w:cstheme="minorHAnsi"/>
+          <w:i/>
+          <w:iCs/>
+          <w:lang w:val="en-US" w:eastAsia="en-GB"/>
+        </w:rPr>
+        <w:t>_fellowname</w:t>
       </w:r>
     </w:p>
     <w:p>
@@ -7067,24 +7298,12 @@
 </file>
 
 <file path=customXml/item1.xml><?xml version="1.0" encoding="utf-8"?>
-<p:properties xmlns:p="http://schemas.microsoft.com/office/2006/metadata/properties" xmlns:xsi="http://www.w3.org/2001/XMLSchema-instance" xmlns:pc="http://schemas.microsoft.com/office/infopath/2007/PartnerControls">
-  <documentManagement>
-    <_ip_UnifiedCompliancePolicyUIAction xmlns="http://schemas.microsoft.com/sharepoint/v3" xsi:nil="true"/>
-    <TaxCatchAll xmlns="4aaf35b1-80a8-48e7-9d03-c612add1997b" xsi:nil="true"/>
-    <_ip_UnifiedCompliancePolicyProperties xmlns="http://schemas.microsoft.com/sharepoint/v3" xsi:nil="true"/>
-    <lcf76f155ced4ddcb4097134ff3c332f xmlns="d1b7efa1-9438-48ed-bd22-e27694e2b769">
-      <Terms xmlns="http://schemas.microsoft.com/office/infopath/2007/PartnerControls"/>
-    </lcf76f155ced4ddcb4097134ff3c332f>
-    <SharedWithUsers xmlns="ee4e07b4-951d-4e5a-a604-67047955f94a">
-      <UserInfo>
-        <DisplayName/>
-        <AccountId xsi:nil="true"/>
-        <AccountType/>
-      </UserInfo>
-    </SharedWithUsers>
-    <MediaLengthInSeconds xmlns="d1b7efa1-9438-48ed-bd22-e27694e2b769" xsi:nil="true"/>
-  </documentManagement>
-</p:properties>
+<?mso-contentType ?>
+<FormTemplates xmlns="http://schemas.microsoft.com/sharepoint/v3/contenttype/forms">
+  <Display>DocumentLibraryForm</Display>
+  <Edit>DocumentLibraryForm</Edit>
+  <New>DocumentLibraryForm</New>
+</FormTemplates>
 </file>
 
 <file path=customXml/item2.xml><?xml version="1.0" encoding="utf-8"?>
@@ -7365,23 +7584,30 @@
 </file>
 
 <file path=customXml/item3.xml><?xml version="1.0" encoding="utf-8"?>
-<?mso-contentType ?>
-<FormTemplates xmlns="http://schemas.microsoft.com/sharepoint/v3/contenttype/forms">
-  <Display>DocumentLibraryForm</Display>
-  <Edit>DocumentLibraryForm</Edit>
-  <New>DocumentLibraryForm</New>
-</FormTemplates>
+<p:properties xmlns:p="http://schemas.microsoft.com/office/2006/metadata/properties" xmlns:xsi="http://www.w3.org/2001/XMLSchema-instance" xmlns:pc="http://schemas.microsoft.com/office/infopath/2007/PartnerControls">
+  <documentManagement>
+    <_ip_UnifiedCompliancePolicyUIAction xmlns="http://schemas.microsoft.com/sharepoint/v3" xsi:nil="true"/>
+    <TaxCatchAll xmlns="4aaf35b1-80a8-48e7-9d03-c612add1997b" xsi:nil="true"/>
+    <_ip_UnifiedCompliancePolicyProperties xmlns="http://schemas.microsoft.com/sharepoint/v3" xsi:nil="true"/>
+    <lcf76f155ced4ddcb4097134ff3c332f xmlns="d1b7efa1-9438-48ed-bd22-e27694e2b769">
+      <Terms xmlns="http://schemas.microsoft.com/office/infopath/2007/PartnerControls"/>
+    </lcf76f155ced4ddcb4097134ff3c332f>
+    <SharedWithUsers xmlns="ee4e07b4-951d-4e5a-a604-67047955f94a">
+      <UserInfo>
+        <DisplayName/>
+        <AccountId xsi:nil="true"/>
+        <AccountType/>
+      </UserInfo>
+    </SharedWithUsers>
+    <MediaLengthInSeconds xmlns="d1b7efa1-9438-48ed-bd22-e27694e2b769" xsi:nil="true"/>
+  </documentManagement>
+</p:properties>
 </file>
 
 <file path=customXml/itemProps1.xml><?xml version="1.0" encoding="utf-8"?>
-<ds:datastoreItem xmlns:ds="http://schemas.openxmlformats.org/officeDocument/2006/customXml" ds:itemID="{497F9DC2-CBFD-4F01-8705-B4C86F5DC629}">
+<ds:datastoreItem xmlns:ds="http://schemas.openxmlformats.org/officeDocument/2006/customXml" ds:itemID="{9570293E-1A16-4A58-A134-B5A5F1E54890}">
   <ds:schemaRefs>
-    <ds:schemaRef ds:uri="http://schemas.microsoft.com/office/2006/metadata/properties"/>
-    <ds:schemaRef ds:uri="http://schemas.microsoft.com/office/infopath/2007/PartnerControls"/>
-    <ds:schemaRef ds:uri="http://schemas.microsoft.com/sharepoint/v3"/>
-    <ds:schemaRef ds:uri="4aaf35b1-80a8-48e7-9d03-c612add1997b"/>
-    <ds:schemaRef ds:uri="d1b7efa1-9438-48ed-bd22-e27694e2b769"/>
-    <ds:schemaRef ds:uri="ee4e07b4-951d-4e5a-a604-67047955f94a"/>
+    <ds:schemaRef ds:uri="http://schemas.microsoft.com/sharepoint/v3/contenttype/forms"/>
   </ds:schemaRefs>
 </ds:datastoreItem>
 </file>
@@ -7408,9 +7634,14 @@
 </file>
 
 <file path=customXml/itemProps3.xml><?xml version="1.0" encoding="utf-8"?>
-<ds:datastoreItem xmlns:ds="http://schemas.openxmlformats.org/officeDocument/2006/customXml" ds:itemID="{9570293E-1A16-4A58-A134-B5A5F1E54890}">
+<ds:datastoreItem xmlns:ds="http://schemas.openxmlformats.org/officeDocument/2006/customXml" ds:itemID="{497F9DC2-CBFD-4F01-8705-B4C86F5DC629}">
   <ds:schemaRefs>
-    <ds:schemaRef ds:uri="http://schemas.microsoft.com/sharepoint/v3/contenttype/forms"/>
+    <ds:schemaRef ds:uri="http://schemas.microsoft.com/office/2006/metadata/properties"/>
+    <ds:schemaRef ds:uri="http://schemas.microsoft.com/office/infopath/2007/PartnerControls"/>
+    <ds:schemaRef ds:uri="http://schemas.microsoft.com/sharepoint/v3"/>
+    <ds:schemaRef ds:uri="4aaf35b1-80a8-48e7-9d03-c612add1997b"/>
+    <ds:schemaRef ds:uri="d1b7efa1-9438-48ed-bd22-e27694e2b769"/>
+    <ds:schemaRef ds:uri="ee4e07b4-951d-4e5a-a604-67047955f94a"/>
   </ds:schemaRefs>
 </ds:datastoreItem>
 </file>
</xml_diff>